<commit_message>
Docs: Set 12-month contract period, remove ISU Tech attribution line
Fixes contract period placeholder to 12 months and removes the
"prepared with assistance of" / draft version footer so the document
reads as uMdoni Municipality's own specification.

Co-Authored-By: Claude Sonnet 5 <noreply@anthropic.com>
</commit_message>
<xml_diff>
--- a/DOCS/06-SPECIFICATIONS/WEBSITE-HOSTING-MAINTENANCE-SPECIFICATION-2026.docx
+++ b/DOCS/06-SPECIFICATIONS/WEBSITE-HOSTING-MAINTENANCE-SPECIFICATION-2026.docx
@@ -46,13 +46,13 @@
         <w:t xml:space="preserve">UMDONI MUNICIPALITY</w:t>
       </w:r>
     </w:p>
-    <w:bookmarkStart w:id="20" w:name="Xa6575217ec47d3d1088df47db3b0244bc2e621f"/>
+    <w:bookmarkStart w:id="20" w:name="X3a2a5e752ba408a0f17c74cabc76e9010e9bcc3"/>
     <w:p>
       <w:pPr>
         <w:pStyle w:val="Heading3"/>
       </w:pPr>
       <w:r>
-        <w:t xml:space="preserve">Appointment of a Service Provider for Website Hosting and Maintenance Services for a Period of [CONTRACT PERIOD — TBD BY SCM]</w:t>
+        <w:t xml:space="preserve">Appointment of a Service Provider for Website Hosting and Maintenance Services for a Period of 12 Months</w:t>
       </w:r>
     </w:p>
     <w:p>
@@ -141,7 +141,7 @@
           <w:bCs/>
           <w:b/>
         </w:rPr>
-        <w:t xml:space="preserve">[CONTRACT PERIOD — TO BE DETERMINED BY SCM]</w:t>
+        <w:t xml:space="preserve">12 (twelve) months</w:t>
       </w:r>
       <w:r>
         <w:t xml:space="preserve">, from date of award, with the option, at the sole discretion of the Municipality, to renew for a further period of</w:t>
@@ -2025,58 +2025,6 @@
           <w:i/>
         </w:rPr>
         <w:t xml:space="preserve">This document is a technical and service specification only. Procurement-process sections — evaluation and scoring criteria, functionality thresholds, B-BBEE requirements, mandatory compliance documentation (tax clearance, CSD registration, etc.), submission instructions, and closing date/venue — are to be completed by Umdoni Municipality’s Supply Chain Management unit before public issue.</w:t>
-      </w:r>
-    </w:p>
-    <w:p>
-      <w:pPr>
-        <w:pStyle w:val="BodyText"/>
-      </w:pPr>
-      <w:r>
-        <w:rPr>
-          <w:bCs/>
-          <w:b/>
-        </w:rPr>
-        <w:t xml:space="preserve">Prepared with the assistance of:</w:t>
-      </w:r>
-      <w:r>
-        <w:t xml:space="preserve"> </w:t>
-      </w:r>
-      <w:r>
-        <w:t xml:space="preserve">ISU Tech (Nhlanhla Mnyandu) — technical input only. This document is uMdoni Municipality’s own specification for a public, open RFQ process.</w:t>
-      </w:r>
-    </w:p>
-    <w:p>
-      <w:pPr>
-        <w:pStyle w:val="BodyText"/>
-      </w:pPr>
-      <w:r>
-        <w:rPr>
-          <w:bCs/>
-          <w:b/>
-        </w:rPr>
-        <w:t xml:space="preserve">Draft version:</w:t>
-      </w:r>
-      <w:r>
-        <w:t xml:space="preserve"> </w:t>
-      </w:r>
-      <w:r>
-        <w:t xml:space="preserve">1.0</w:t>
-      </w:r>
-      <w:r>
-        <w:t xml:space="preserve"> </w:t>
-      </w:r>
-      <w:r>
-        <w:rPr>
-          <w:bCs/>
-          <w:b/>
-        </w:rPr>
-        <w:t xml:space="preserve">Draft date:</w:t>
-      </w:r>
-      <w:r>
-        <w:t xml:space="preserve"> </w:t>
-      </w:r>
-      <w:r>
-        <w:t xml:space="preserve">22 July 2026</w:t>
       </w:r>
     </w:p>
     <w:bookmarkEnd w:id="37"/>

</xml_diff>